<commit_message>
Sin and Cos for DateTime features
</commit_message>
<xml_diff>
--- a/checkpoints/milestone-2/Machine-Learning-milestone-2.docx
+++ b/checkpoints/milestone-2/Machine-Learning-milestone-2.docx
@@ -234,12 +234,12 @@
           <wp:inline distB="114300" distT="114300" distL="114300" distR="114300">
             <wp:extent cx="3781425" cy="1781175"/>
             <wp:effectExtent b="0" l="0" r="0" t="0"/>
-            <wp:docPr id="3" name="image1.png"/>
+            <wp:docPr id="3" name="image2.png"/>
             <a:graphic>
               <a:graphicData uri="http://schemas.openxmlformats.org/drawingml/2006/picture">
                 <pic:pic>
                   <pic:nvPicPr>
-                    <pic:cNvPr id="0" name="image1.png"/>
+                    <pic:cNvPr id="0" name="image2.png"/>
                     <pic:cNvPicPr preferRelativeResize="0"/>
                   </pic:nvPicPr>
                   <pic:blipFill>
@@ -1140,7 +1140,7 @@
       <w:pPr>
         <w:numPr>
           <w:ilvl w:val="0"/>
-          <w:numId w:val="2"/>
+          <w:numId w:val="3"/>
         </w:numPr>
         <w:ind w:left="720" w:hanging="360"/>
         <w:jc w:val="both"/>
@@ -1236,7 +1236,7 @@
       <w:pPr>
         <w:numPr>
           <w:ilvl w:val="0"/>
-          <w:numId w:val="2"/>
+          <w:numId w:val="3"/>
         </w:numPr>
         <w:ind w:left="720" w:hanging="360"/>
         <w:jc w:val="both"/>
@@ -1472,7 +1472,7 @@
       <w:pPr>
         <w:numPr>
           <w:ilvl w:val="0"/>
-          <w:numId w:val="2"/>
+          <w:numId w:val="3"/>
         </w:numPr>
         <w:ind w:left="720" w:hanging="360"/>
         <w:jc w:val="both"/>
@@ -1496,7 +1496,7 @@
       <w:pPr>
         <w:numPr>
           <w:ilvl w:val="0"/>
-          <w:numId w:val="2"/>
+          <w:numId w:val="3"/>
         </w:numPr>
         <w:ind w:left="720" w:hanging="360"/>
         <w:jc w:val="both"/>
@@ -1580,7 +1580,7 @@
       <w:pPr>
         <w:numPr>
           <w:ilvl w:val="0"/>
-          <w:numId w:val="2"/>
+          <w:numId w:val="3"/>
         </w:numPr>
         <w:ind w:left="720" w:hanging="360"/>
         <w:jc w:val="both"/>
@@ -1784,7 +1784,7 @@
       <w:pPr>
         <w:numPr>
           <w:ilvl w:val="0"/>
-          <w:numId w:val="2"/>
+          <w:numId w:val="3"/>
         </w:numPr>
         <w:ind w:left="720" w:hanging="360"/>
         <w:jc w:val="both"/>
@@ -1819,7 +1819,7 @@
       <w:pPr>
         <w:numPr>
           <w:ilvl w:val="0"/>
-          <w:numId w:val="2"/>
+          <w:numId w:val="3"/>
         </w:numPr>
         <w:ind w:left="720" w:hanging="360"/>
         <w:jc w:val="both"/>
@@ -2000,12 +2000,12 @@
           <wp:inline distB="114300" distT="114300" distL="114300" distR="114300">
             <wp:extent cx="5731200" cy="2374900"/>
             <wp:effectExtent b="0" l="0" r="0" t="0"/>
-            <wp:docPr id="2" name="image4.png"/>
+            <wp:docPr id="2" name="image1.png"/>
             <a:graphic>
               <a:graphicData uri="http://schemas.openxmlformats.org/drawingml/2006/picture">
                 <pic:pic>
                   <pic:nvPicPr>
-                    <pic:cNvPr id="0" name="image4.png"/>
+                    <pic:cNvPr id="0" name="image1.png"/>
                     <pic:cNvPicPr preferRelativeResize="0"/>
                   </pic:nvPicPr>
                   <pic:blipFill>
@@ -2092,12 +2092,12 @@
           <wp:inline distB="114300" distT="114300" distL="114300" distR="114300">
             <wp:extent cx="5731200" cy="2374900"/>
             <wp:effectExtent b="0" l="0" r="0" t="0"/>
-            <wp:docPr id="4" name="image2.png"/>
+            <wp:docPr id="4" name="image4.png"/>
             <a:graphic>
               <a:graphicData uri="http://schemas.openxmlformats.org/drawingml/2006/picture">
                 <pic:pic>
                   <pic:nvPicPr>
-                    <pic:cNvPr id="0" name="image2.png"/>
+                    <pic:cNvPr id="0" name="image4.png"/>
                     <pic:cNvPicPr preferRelativeResize="0"/>
                   </pic:nvPicPr>
                   <pic:blipFill>
@@ -2321,14 +2321,76 @@
           <w:szCs w:val="24"/>
           <w:rtl w:val="0"/>
         </w:rPr>
-        <w:t xml:space="preserve">The final dataset size was checked, and a correlation matrix heatmap was created for all numerical and binary features to spot redundant variables. </w:t>
-      </w:r>
-    </w:p>
-    <w:p>
-      <w:pPr>
-        <w:jc w:val="both"/>
-        <w:rPr>
-          <w:rFonts w:ascii="Times New Roman" w:cs="Times New Roman" w:eastAsia="Times New Roman" w:hAnsi="Times New Roman"/>
+        <w:t xml:space="preserve">Cyclical sine/cosine transformations were applied to the temporal features (</w:t>
+      </w:r>
+      <w:r>
+        <w:rPr>
+          <w:rFonts w:ascii="Times New Roman" w:cs="Times New Roman" w:eastAsia="Times New Roman" w:hAnsi="Times New Roman"/>
+          <w:b w:val="1"/>
+          <w:bCs w:val="1"/>
+          <w:sz w:val="24"/>
+          <w:szCs w:val="24"/>
+          <w:rtl w:val="0"/>
+        </w:rPr>
+        <w:t xml:space="preserve">DateTime_hour</w:t>
+      </w:r>
+      <w:r>
+        <w:rPr>
+          <w:rFonts w:ascii="Times New Roman" w:cs="Times New Roman" w:eastAsia="Times New Roman" w:hAnsi="Times New Roman"/>
+          <w:sz w:val="24"/>
+          <w:szCs w:val="24"/>
+          <w:rtl w:val="0"/>
+        </w:rPr>
+        <w:t xml:space="preserve">, </w:t>
+      </w:r>
+      <w:r>
+        <w:rPr>
+          <w:rFonts w:ascii="Times New Roman" w:cs="Times New Roman" w:eastAsia="Times New Roman" w:hAnsi="Times New Roman"/>
+          <w:b w:val="1"/>
+          <w:bCs w:val="1"/>
+          <w:sz w:val="24"/>
+          <w:szCs w:val="24"/>
+          <w:rtl w:val="0"/>
+        </w:rPr>
+        <w:t xml:space="preserve">DateTime_weekday</w:t>
+      </w:r>
+      <w:r>
+        <w:rPr>
+          <w:rFonts w:ascii="Times New Roman" w:cs="Times New Roman" w:eastAsia="Times New Roman" w:hAnsi="Times New Roman"/>
+          <w:sz w:val="24"/>
+          <w:szCs w:val="24"/>
+          <w:rtl w:val="0"/>
+        </w:rPr>
+        <w:t xml:space="preserve">, and </w:t>
+      </w:r>
+      <w:r>
+        <w:rPr>
+          <w:rFonts w:ascii="Times New Roman" w:cs="Times New Roman" w:eastAsia="Times New Roman" w:hAnsi="Times New Roman"/>
+          <w:b w:val="1"/>
+          <w:bCs w:val="1"/>
+          <w:sz w:val="24"/>
+          <w:szCs w:val="24"/>
+          <w:rtl w:val="0"/>
+        </w:rPr>
+        <w:t xml:space="preserve">DateTime_month</w:t>
+      </w:r>
+      <w:r>
+        <w:rPr>
+          <w:rFonts w:ascii="Times New Roman" w:cs="Times New Roman" w:eastAsia="Times New Roman" w:hAnsi="Times New Roman"/>
+          <w:sz w:val="24"/>
+          <w:szCs w:val="24"/>
+          <w:rtl w:val="0"/>
+        </w:rPr>
+        <w:t xml:space="preserve">) to preserve their circular nature. Following this a Pearson correlation matrix was computed and visualized across all numerical and binary features to detect potential multicollinearity.</w:t>
+      </w:r>
+    </w:p>
+    <w:p>
+      <w:pPr>
+        <w:jc w:val="both"/>
+        <w:rPr>
+          <w:rFonts w:ascii="Times New Roman" w:cs="Times New Roman" w:eastAsia="Times New Roman" w:hAnsi="Times New Roman"/>
+          <w:b w:val="1"/>
+          <w:bCs w:val="1"/>
           <w:sz w:val="24"/>
           <w:szCs w:val="24"/>
         </w:rPr>
@@ -2343,38 +2405,6 @@
           <w:rtl w:val="0"/>
         </w:rPr>
         <w:t xml:space="preserve">Why was it necessary? </w:t>
-      </w:r>
-      <w:r>
-        <w:rPr>
-          <w:rFonts w:ascii="Times New Roman" w:cs="Times New Roman" w:eastAsia="Times New Roman" w:hAnsi="Times New Roman"/>
-          <w:sz w:val="24"/>
-          <w:szCs w:val="24"/>
-          <w:rtl w:val="0"/>
-        </w:rPr>
-        <w:t xml:space="preserve">Highly correlated features can confuse machine learning models, cause overfitting, and slow down training. Therefore, it is important to check for highly correlated features and remove them if necessary. Ensuring a clean feature space leads to a more stable and efficient model.</w:t>
-      </w:r>
-    </w:p>
-    <w:p>
-      <w:pPr>
-        <w:jc w:val="both"/>
-        <w:rPr>
-          <w:rFonts w:ascii="Times New Roman" w:cs="Times New Roman" w:eastAsia="Times New Roman" w:hAnsi="Times New Roman"/>
-          <w:b w:val="1"/>
-          <w:bCs w:val="1"/>
-          <w:sz w:val="24"/>
-          <w:szCs w:val="24"/>
-        </w:rPr>
-      </w:pPr>
-      <w:r>
-        <w:rPr>
-          <w:rFonts w:ascii="Times New Roman" w:cs="Times New Roman" w:eastAsia="Times New Roman" w:hAnsi="Times New Roman"/>
-          <w:b w:val="1"/>
-          <w:bCs w:val="1"/>
-          <w:sz w:val="24"/>
-          <w:szCs w:val="24"/>
-          <w:rtl w:val="0"/>
-        </w:rPr>
-        <w:t xml:space="preserve">How was it implemented? </w:t>
       </w:r>
     </w:p>
     <w:p>
@@ -2389,67 +2419,28 @@
           <w:rFonts w:ascii="Times New Roman" w:cs="Times New Roman" w:eastAsia="Times New Roman" w:hAnsi="Times New Roman"/>
           <w:sz w:val="24"/>
           <w:szCs w:val="24"/>
-        </w:rPr>
-      </w:pPr>
-      <w:r>
-        <w:rPr>
-          <w:rFonts w:ascii="Times New Roman" w:cs="Times New Roman" w:eastAsia="Times New Roman" w:hAnsi="Times New Roman"/>
-          <w:b w:val="1"/>
-          <w:bCs w:val="1"/>
-          <w:sz w:val="24"/>
-          <w:szCs w:val="24"/>
-          <w:rtl w:val="0"/>
-        </w:rPr>
-        <w:t xml:space="preserve">Dimensions check: </w:t>
-      </w:r>
-      <w:r>
-        <w:rPr>
-          <w:rFonts w:ascii="Times New Roman" w:cs="Times New Roman" w:eastAsia="Times New Roman" w:hAnsi="Times New Roman"/>
-          <w:sz w:val="24"/>
-          <w:szCs w:val="24"/>
-          <w:rtl w:val="0"/>
-        </w:rPr>
-        <w:t xml:space="preserve">The total sample count and active feature columns of </w:t>
-      </w:r>
-      <w:r>
-        <w:rPr>
-          <w:rFonts w:ascii="Times New Roman" w:cs="Times New Roman" w:eastAsia="Times New Roman" w:hAnsi="Times New Roman"/>
-          <w:b w:val="1"/>
-          <w:bCs w:val="1"/>
-          <w:sz w:val="24"/>
-          <w:szCs w:val="24"/>
-          <w:rtl w:val="0"/>
-        </w:rPr>
-        <w:t xml:space="preserve">train_transformed</w:t>
-      </w:r>
-      <w:r>
-        <w:rPr>
-          <w:rFonts w:ascii="Times New Roman" w:cs="Times New Roman" w:eastAsia="Times New Roman" w:hAnsi="Times New Roman"/>
-          <w:sz w:val="24"/>
-          <w:szCs w:val="24"/>
-          <w:rtl w:val="0"/>
-        </w:rPr>
-        <w:t xml:space="preserve"> were summarized (excluding auxiliary variables like </w:t>
-      </w:r>
-      <w:r>
-        <w:rPr>
-          <w:rFonts w:ascii="Times New Roman" w:cs="Times New Roman" w:eastAsia="Times New Roman" w:hAnsi="Times New Roman"/>
-          <w:b w:val="1"/>
-          <w:bCs w:val="1"/>
-          <w:sz w:val="24"/>
-          <w:szCs w:val="24"/>
-          <w:rtl w:val="0"/>
-        </w:rPr>
-        <w:t xml:space="preserve">fold</w:t>
-      </w:r>
-      <w:r>
-        <w:rPr>
-          <w:rFonts w:ascii="Times New Roman" w:cs="Times New Roman" w:eastAsia="Times New Roman" w:hAnsi="Times New Roman"/>
-          <w:sz w:val="24"/>
-          <w:szCs w:val="24"/>
-          <w:rtl w:val="0"/>
-        </w:rPr>
-        <w:t xml:space="preserve">).  </w:t>
+          <w:u w:val="none"/>
+        </w:rPr>
+      </w:pPr>
+      <w:r>
+        <w:rPr>
+          <w:rFonts w:ascii="Times New Roman" w:cs="Times New Roman" w:eastAsia="Times New Roman" w:hAnsi="Times New Roman"/>
+          <w:b w:val="1"/>
+          <w:bCs w:val="1"/>
+          <w:sz w:val="24"/>
+          <w:szCs w:val="24"/>
+          <w:rtl w:val="0"/>
+        </w:rPr>
+        <w:t xml:space="preserve">Cyclical Encoding: </w:t>
+      </w:r>
+      <w:r>
+        <w:rPr>
+          <w:rFonts w:ascii="Times New Roman" w:cs="Times New Roman" w:eastAsia="Times New Roman" w:hAnsi="Times New Roman"/>
+          <w:sz w:val="24"/>
+          <w:szCs w:val="24"/>
+          <w:rtl w:val="0"/>
+        </w:rPr>
+        <w:t xml:space="preserve">Standard linear scales treat time variables as independent straight-line values (making hour 23 look excessively far from hour 0). Sine and cosine transformations map them onto a continuous circular coordinate system, allowing the Pearson correlation matrix and linear models to correctly capture true temporal proximity. </w:t>
       </w:r>
     </w:p>
     <w:p>
@@ -2464,34 +2455,243 @@
           <w:rFonts w:ascii="Times New Roman" w:cs="Times New Roman" w:eastAsia="Times New Roman" w:hAnsi="Times New Roman"/>
           <w:sz w:val="24"/>
           <w:szCs w:val="24"/>
-        </w:rPr>
-      </w:pPr>
-      <w:r>
-        <w:rPr>
-          <w:rFonts w:ascii="Times New Roman" w:cs="Times New Roman" w:eastAsia="Times New Roman" w:hAnsi="Times New Roman"/>
-          <w:b w:val="1"/>
-          <w:bCs w:val="1"/>
-          <w:sz w:val="24"/>
-          <w:szCs w:val="24"/>
-          <w:rtl w:val="0"/>
-        </w:rPr>
-        <w:t xml:space="preserve">Correlation heatmap:</w:t>
-      </w:r>
-      <w:r>
-        <w:rPr>
-          <w:rFonts w:ascii="Times New Roman" w:cs="Times New Roman" w:eastAsia="Times New Roman" w:hAnsi="Times New Roman"/>
-          <w:sz w:val="24"/>
-          <w:szCs w:val="24"/>
-          <w:rtl w:val="0"/>
-        </w:rPr>
-        <w:t xml:space="preserve"> Pearson correlation coefficients were calculated for all numeric features and visualized using a heatmap </w:t>
+          <w:u w:val="none"/>
+        </w:rPr>
+      </w:pPr>
+      <w:r>
+        <w:rPr>
+          <w:rFonts w:ascii="Times New Roman" w:cs="Times New Roman" w:eastAsia="Times New Roman" w:hAnsi="Times New Roman"/>
+          <w:b w:val="1"/>
+          <w:bCs w:val="1"/>
+          <w:sz w:val="24"/>
+          <w:szCs w:val="24"/>
+          <w:rtl w:val="0"/>
+        </w:rPr>
+        <w:t xml:space="preserve">Multicollinearity Check:</w:t>
+      </w:r>
+      <w:r>
+        <w:rPr>
+          <w:rFonts w:ascii="Times New Roman" w:cs="Times New Roman" w:eastAsia="Times New Roman" w:hAnsi="Times New Roman"/>
+          <w:sz w:val="24"/>
+          <w:szCs w:val="24"/>
+          <w:rtl w:val="0"/>
+        </w:rPr>
+        <w:t xml:space="preserve"> High correlation among input features can destabilize model coefficients and degrade performance. Checking the correlation matrix helps identify and flag redundant variables. </w:t>
+      </w:r>
+    </w:p>
+    <w:p>
+      <w:pPr>
+        <w:jc w:val="both"/>
+        <w:rPr>
+          <w:rFonts w:ascii="Times New Roman" w:cs="Times New Roman" w:eastAsia="Times New Roman" w:hAnsi="Times New Roman"/>
+          <w:b w:val="1"/>
+          <w:bCs w:val="1"/>
+          <w:sz w:val="24"/>
+          <w:szCs w:val="24"/>
+        </w:rPr>
+      </w:pPr>
+      <w:r>
+        <w:rPr>
+          <w:rFonts w:ascii="Times New Roman" w:cs="Times New Roman" w:eastAsia="Times New Roman" w:hAnsi="Times New Roman"/>
+          <w:b w:val="1"/>
+          <w:bCs w:val="1"/>
+          <w:sz w:val="24"/>
+          <w:szCs w:val="24"/>
+          <w:rtl w:val="0"/>
+        </w:rPr>
+        <w:t xml:space="preserve">How was it implemented? </w:t>
       </w:r>
     </w:p>
     <w:p>
       <w:pPr>
         <w:numPr>
           <w:ilvl w:val="0"/>
-          <w:numId w:val="2"/>
+          <w:numId w:val="3"/>
+        </w:numPr>
+        <w:ind w:left="720" w:hanging="360"/>
+        <w:jc w:val="both"/>
+        <w:rPr>
+          <w:rFonts w:ascii="Times New Roman" w:cs="Times New Roman" w:eastAsia="Times New Roman" w:hAnsi="Times New Roman"/>
+          <w:sz w:val="24"/>
+          <w:szCs w:val="24"/>
+        </w:rPr>
+      </w:pPr>
+      <w:r>
+        <w:rPr>
+          <w:rFonts w:ascii="Times New Roman" w:cs="Times New Roman" w:eastAsia="Times New Roman" w:hAnsi="Times New Roman"/>
+          <w:b w:val="1"/>
+          <w:bCs w:val="1"/>
+          <w:sz w:val="24"/>
+          <w:szCs w:val="24"/>
+          <w:rtl w:val="0"/>
+        </w:rPr>
+        <w:t xml:space="preserve">Dimensions check: </w:t>
+      </w:r>
+      <w:r>
+        <w:rPr>
+          <w:rFonts w:ascii="Times New Roman" w:cs="Times New Roman" w:eastAsia="Times New Roman" w:hAnsi="Times New Roman"/>
+          <w:sz w:val="24"/>
+          <w:szCs w:val="24"/>
+          <w:rtl w:val="0"/>
+        </w:rPr>
+        <w:t xml:space="preserve">The total sample count and active feature columns of </w:t>
+      </w:r>
+      <w:r>
+        <w:rPr>
+          <w:rFonts w:ascii="Times New Roman" w:cs="Times New Roman" w:eastAsia="Times New Roman" w:hAnsi="Times New Roman"/>
+          <w:b w:val="1"/>
+          <w:bCs w:val="1"/>
+          <w:sz w:val="24"/>
+          <w:szCs w:val="24"/>
+          <w:rtl w:val="0"/>
+        </w:rPr>
+        <w:t xml:space="preserve">train_transformed</w:t>
+      </w:r>
+      <w:r>
+        <w:rPr>
+          <w:rFonts w:ascii="Times New Roman" w:cs="Times New Roman" w:eastAsia="Times New Roman" w:hAnsi="Times New Roman"/>
+          <w:sz w:val="24"/>
+          <w:szCs w:val="24"/>
+          <w:rtl w:val="0"/>
+        </w:rPr>
+        <w:t xml:space="preserve"> were summarized (excluding auxiliary variables like </w:t>
+      </w:r>
+      <w:r>
+        <w:rPr>
+          <w:rFonts w:ascii="Times New Roman" w:cs="Times New Roman" w:eastAsia="Times New Roman" w:hAnsi="Times New Roman"/>
+          <w:b w:val="1"/>
+          <w:bCs w:val="1"/>
+          <w:sz w:val="24"/>
+          <w:szCs w:val="24"/>
+          <w:rtl w:val="0"/>
+        </w:rPr>
+        <w:t xml:space="preserve">fold</w:t>
+      </w:r>
+      <w:r>
+        <w:rPr>
+          <w:rFonts w:ascii="Times New Roman" w:cs="Times New Roman" w:eastAsia="Times New Roman" w:hAnsi="Times New Roman"/>
+          <w:sz w:val="24"/>
+          <w:szCs w:val="24"/>
+          <w:rtl w:val="0"/>
+        </w:rPr>
+        <w:t xml:space="preserve">).</w:t>
+      </w:r>
+    </w:p>
+    <w:p>
+      <w:pPr>
+        <w:numPr>
+          <w:ilvl w:val="0"/>
+          <w:numId w:val="3"/>
+        </w:numPr>
+        <w:ind w:left="720" w:hanging="360"/>
+        <w:jc w:val="both"/>
+        <w:rPr>
+          <w:rFonts w:ascii="Times New Roman" w:cs="Times New Roman" w:eastAsia="Times New Roman" w:hAnsi="Times New Roman"/>
+          <w:sz w:val="24"/>
+          <w:szCs w:val="24"/>
+        </w:rPr>
+      </w:pPr>
+      <w:r>
+        <w:rPr>
+          <w:rFonts w:ascii="Times New Roman" w:cs="Times New Roman" w:eastAsia="Times New Roman" w:hAnsi="Times New Roman"/>
+          <w:b w:val="1"/>
+          <w:bCs w:val="1"/>
+          <w:sz w:val="24"/>
+          <w:szCs w:val="24"/>
+          <w:rtl w:val="0"/>
+        </w:rPr>
+        <w:t xml:space="preserve">Cyclical Time Transformation: </w:t>
+      </w:r>
+      <w:r>
+        <w:rPr>
+          <w:rFonts w:ascii="Times New Roman" w:cs="Times New Roman" w:eastAsia="Times New Roman" w:hAnsi="Times New Roman"/>
+          <w:sz w:val="24"/>
+          <w:szCs w:val="24"/>
+          <w:rtl w:val="0"/>
+        </w:rPr>
+        <w:t xml:space="preserve">Dropped raw time features and converted them into coordinate pairs (</w:t>
+      </w:r>
+      <w:r>
+        <w:rPr>
+          <w:rFonts w:ascii="Times New Roman" w:cs="Times New Roman" w:eastAsia="Times New Roman" w:hAnsi="Times New Roman"/>
+          <w:b w:val="1"/>
+          <w:bCs w:val="1"/>
+          <w:sz w:val="24"/>
+          <w:szCs w:val="24"/>
+          <w:rtl w:val="0"/>
+        </w:rPr>
+        <w:t xml:space="preserve">_sin</w:t>
+      </w:r>
+      <w:r>
+        <w:rPr>
+          <w:rFonts w:ascii="Times New Roman" w:cs="Times New Roman" w:eastAsia="Times New Roman" w:hAnsi="Times New Roman"/>
+          <w:sz w:val="24"/>
+          <w:szCs w:val="24"/>
+          <w:rtl w:val="0"/>
+        </w:rPr>
+        <w:t xml:space="preserve"> and </w:t>
+      </w:r>
+      <w:r>
+        <w:rPr>
+          <w:rFonts w:ascii="Times New Roman" w:cs="Times New Roman" w:eastAsia="Times New Roman" w:hAnsi="Times New Roman"/>
+          <w:b w:val="1"/>
+          <w:bCs w:val="1"/>
+          <w:sz w:val="24"/>
+          <w:szCs w:val="24"/>
+          <w:rtl w:val="0"/>
+        </w:rPr>
+        <w:t xml:space="preserve">_cos</w:t>
+      </w:r>
+      <w:r>
+        <w:rPr>
+          <w:rFonts w:ascii="Times New Roman" w:cs="Times New Roman" w:eastAsia="Times New Roman" w:hAnsi="Times New Roman"/>
+          <w:sz w:val="24"/>
+          <w:szCs w:val="24"/>
+          <w:rtl w:val="0"/>
+        </w:rPr>
+        <w:t xml:space="preserve">) using trigonometric formulas divided by their respective cyclical periods (24 for hours, 7 for weekdays, 12 for months).</w:t>
+      </w:r>
+    </w:p>
+    <w:p>
+      <w:pPr>
+        <w:numPr>
+          <w:ilvl w:val="0"/>
+          <w:numId w:val="3"/>
+        </w:numPr>
+        <w:ind w:left="720" w:hanging="360"/>
+        <w:jc w:val="both"/>
+        <w:rPr>
+          <w:rFonts w:ascii="Times New Roman" w:cs="Times New Roman" w:eastAsia="Times New Roman" w:hAnsi="Times New Roman"/>
+          <w:sz w:val="24"/>
+          <w:szCs w:val="24"/>
+        </w:rPr>
+      </w:pPr>
+      <w:r>
+        <w:rPr>
+          <w:rFonts w:ascii="Times New Roman" w:cs="Times New Roman" w:eastAsia="Times New Roman" w:hAnsi="Times New Roman"/>
+          <w:b w:val="1"/>
+          <w:bCs w:val="1"/>
+          <w:sz w:val="24"/>
+          <w:szCs w:val="24"/>
+          <w:rtl w:val="0"/>
+        </w:rPr>
+        <w:t xml:space="preserve">Correlation heatmap:</w:t>
+      </w:r>
+      <w:r>
+        <w:rPr>
+          <w:rFonts w:ascii="Times New Roman" w:cs="Times New Roman" w:eastAsia="Times New Roman" w:hAnsi="Times New Roman"/>
+          <w:sz w:val="24"/>
+          <w:szCs w:val="24"/>
+          <w:rtl w:val="0"/>
+        </w:rPr>
+        <w:t xml:space="preserve"> Pearson correlation coefficients were calculated for all numeric features and visualized using a heatmap </w:t>
+      </w:r>
+    </w:p>
+    <w:p>
+      <w:pPr>
+        <w:numPr>
+          <w:ilvl w:val="0"/>
+          <w:numId w:val="3"/>
         </w:numPr>
         <w:ind w:left="720" w:hanging="360"/>
         <w:jc w:val="both"/>
@@ -2820,11 +3020,124 @@
       </w:rPr>
     </w:lvl>
   </w:abstractNum>
+  <w:abstractNum w:abstractNumId="3">
+    <w:lvl w:ilvl="0">
+      <w:start w:val="1"/>
+      <w:numFmt w:val="bullet"/>
+      <w:lvlText w:val="●"/>
+      <w:lvlJc w:val="left"/>
+      <w:pPr>
+        <w:ind w:left="720" w:hanging="360"/>
+      </w:pPr>
+      <w:rPr>
+        <w:u w:val="none"/>
+      </w:rPr>
+    </w:lvl>
+    <w:lvl w:ilvl="1">
+      <w:start w:val="1"/>
+      <w:numFmt w:val="bullet"/>
+      <w:lvlText w:val="○"/>
+      <w:lvlJc w:val="left"/>
+      <w:pPr>
+        <w:ind w:left="1440" w:hanging="360"/>
+      </w:pPr>
+      <w:rPr>
+        <w:u w:val="none"/>
+      </w:rPr>
+    </w:lvl>
+    <w:lvl w:ilvl="2">
+      <w:start w:val="1"/>
+      <w:numFmt w:val="bullet"/>
+      <w:lvlText w:val="■"/>
+      <w:lvlJc w:val="left"/>
+      <w:pPr>
+        <w:ind w:left="2160" w:hanging="360"/>
+      </w:pPr>
+      <w:rPr>
+        <w:u w:val="none"/>
+      </w:rPr>
+    </w:lvl>
+    <w:lvl w:ilvl="3">
+      <w:start w:val="1"/>
+      <w:numFmt w:val="bullet"/>
+      <w:lvlText w:val="●"/>
+      <w:lvlJc w:val="left"/>
+      <w:pPr>
+        <w:ind w:left="2880" w:hanging="360"/>
+      </w:pPr>
+      <w:rPr>
+        <w:u w:val="none"/>
+      </w:rPr>
+    </w:lvl>
+    <w:lvl w:ilvl="4">
+      <w:start w:val="1"/>
+      <w:numFmt w:val="bullet"/>
+      <w:lvlText w:val="○"/>
+      <w:lvlJc w:val="left"/>
+      <w:pPr>
+        <w:ind w:left="3600" w:hanging="360"/>
+      </w:pPr>
+      <w:rPr>
+        <w:u w:val="none"/>
+      </w:rPr>
+    </w:lvl>
+    <w:lvl w:ilvl="5">
+      <w:start w:val="1"/>
+      <w:numFmt w:val="bullet"/>
+      <w:lvlText w:val="■"/>
+      <w:lvlJc w:val="left"/>
+      <w:pPr>
+        <w:ind w:left="4320" w:hanging="360"/>
+      </w:pPr>
+      <w:rPr>
+        <w:u w:val="none"/>
+      </w:rPr>
+    </w:lvl>
+    <w:lvl w:ilvl="6">
+      <w:start w:val="1"/>
+      <w:numFmt w:val="bullet"/>
+      <w:lvlText w:val="●"/>
+      <w:lvlJc w:val="left"/>
+      <w:pPr>
+        <w:ind w:left="5040" w:hanging="360"/>
+      </w:pPr>
+      <w:rPr>
+        <w:u w:val="none"/>
+      </w:rPr>
+    </w:lvl>
+    <w:lvl w:ilvl="7">
+      <w:start w:val="1"/>
+      <w:numFmt w:val="bullet"/>
+      <w:lvlText w:val="○"/>
+      <w:lvlJc w:val="left"/>
+      <w:pPr>
+        <w:ind w:left="5760" w:hanging="360"/>
+      </w:pPr>
+      <w:rPr>
+        <w:u w:val="none"/>
+      </w:rPr>
+    </w:lvl>
+    <w:lvl w:ilvl="8">
+      <w:start w:val="1"/>
+      <w:numFmt w:val="bullet"/>
+      <w:lvlText w:val="■"/>
+      <w:lvlJc w:val="left"/>
+      <w:pPr>
+        <w:ind w:left="6480" w:hanging="360"/>
+      </w:pPr>
+      <w:rPr>
+        <w:u w:val="none"/>
+      </w:rPr>
+    </w:lvl>
+  </w:abstractNum>
   <w:num w:numId="1">
     <w:abstractNumId w:val="1"/>
   </w:num>
   <w:num w:numId="2">
     <w:abstractNumId w:val="2"/>
+  </w:num>
+  <w:num w:numId="3">
+    <w:abstractNumId w:val="3"/>
   </w:num>
 </w:numbering>
 </file>

</xml_diff>